<commit_message>
improvements and order done
</commit_message>
<xml_diff>
--- a/explication.docx
+++ b/explication.docx
@@ -118,7 +118,7 @@
     <w:p>
       <w:r>
         <w:pict w14:anchorId="49D8C9E5">
-          <v:rect id="_x0000_i1115" style="width:0;height:1.5pt" o:hralign="center" o:hrstd="t" o:hr="t" fillcolor="#a0a0a0" stroked="f"/>
+          <v:rect id="_x0000_i1025" style="width:0;height:1.5pt" o:hralign="center" o:hrstd="t" o:hr="t" fillcolor="#a0a0a0" stroked="f"/>
         </w:pict>
       </w:r>
     </w:p>
@@ -328,7 +328,7 @@
     <w:p>
       <w:r>
         <w:pict w14:anchorId="1CC62864">
-          <v:rect id="_x0000_i1116" style="width:0;height:1.5pt" o:hralign="center" o:hrstd="t" o:hr="t" fillcolor="#a0a0a0" stroked="f"/>
+          <v:rect id="_x0000_i1026" style="width:0;height:1.5pt" o:hralign="center" o:hrstd="t" o:hr="t" fillcolor="#a0a0a0" stroked="f"/>
         </w:pict>
       </w:r>
     </w:p>
@@ -558,7 +558,7 @@
     <w:p>
       <w:r>
         <w:pict w14:anchorId="790841C4">
-          <v:rect id="_x0000_i1117" style="width:0;height:1.5pt" o:hralign="center" o:hrstd="t" o:hr="t" fillcolor="#a0a0a0" stroked="f"/>
+          <v:rect id="_x0000_i1027" style="width:0;height:1.5pt" o:hralign="center" o:hrstd="t" o:hr="t" fillcolor="#a0a0a0" stroked="f"/>
         </w:pict>
       </w:r>
     </w:p>
@@ -830,7 +830,7 @@
     <w:p>
       <w:r>
         <w:pict w14:anchorId="4CCFFA4F">
-          <v:rect id="_x0000_i1118" style="width:0;height:1.5pt" o:hralign="center" o:hrstd="t" o:hr="t" fillcolor="#a0a0a0" stroked="f"/>
+          <v:rect id="_x0000_i1028" style="width:0;height:1.5pt" o:hralign="center" o:hrstd="t" o:hr="t" fillcolor="#a0a0a0" stroked="f"/>
         </w:pict>
       </w:r>
     </w:p>
@@ -899,7 +899,7 @@
     <w:p>
       <w:r>
         <w:pict w14:anchorId="61C27726">
-          <v:rect id="_x0000_i1119" style="width:0;height:1.5pt" o:hralign="center" o:hrstd="t" o:hr="t" fillcolor="#a0a0a0" stroked="f"/>
+          <v:rect id="_x0000_i1029" style="width:0;height:1.5pt" o:hralign="center" o:hrstd="t" o:hr="t" fillcolor="#a0a0a0" stroked="f"/>
         </w:pict>
       </w:r>
     </w:p>
@@ -1066,7 +1066,7 @@
     <w:p>
       <w:r>
         <w:pict w14:anchorId="7C61CD75">
-          <v:rect id="_x0000_i1120" style="width:0;height:1.5pt" o:hralign="center" o:hrstd="t" o:hr="t" fillcolor="#a0a0a0" stroked="f"/>
+          <v:rect id="_x0000_i1030" style="width:0;height:1.5pt" o:hralign="center" o:hrstd="t" o:hr="t" fillcolor="#a0a0a0" stroked="f"/>
         </w:pict>
       </w:r>
     </w:p>
@@ -1203,7 +1203,7 @@
     <w:p>
       <w:r>
         <w:pict w14:anchorId="4F140DD8">
-          <v:rect id="_x0000_i1121" style="width:0;height:1.5pt" o:hralign="center" o:hrstd="t" o:hr="t" fillcolor="#a0a0a0" stroked="f"/>
+          <v:rect id="_x0000_i1031" style="width:0;height:1.5pt" o:hralign="center" o:hrstd="t" o:hr="t" fillcolor="#a0a0a0" stroked="f"/>
         </w:pict>
       </w:r>
     </w:p>
@@ -1398,7 +1398,7 @@
     <w:p>
       <w:r>
         <w:pict w14:anchorId="4F63F98D">
-          <v:rect id="_x0000_i1122" style="width:0;height:1.5pt" o:hralign="center" o:hrstd="t" o:hr="t" fillcolor="#a0a0a0" stroked="f"/>
+          <v:rect id="_x0000_i1032" style="width:0;height:1.5pt" o:hralign="center" o:hrstd="t" o:hr="t" fillcolor="#a0a0a0" stroked="f"/>
         </w:pict>
       </w:r>
     </w:p>
@@ -1611,7 +1611,7 @@
     <w:p>
       <w:r>
         <w:pict w14:anchorId="49696725">
-          <v:rect id="_x0000_i1123" style="width:0;height:1.5pt" o:hralign="center" o:hrstd="t" o:hr="t" fillcolor="#a0a0a0" stroked="f"/>
+          <v:rect id="_x0000_i1033" style="width:0;height:1.5pt" o:hralign="center" o:hrstd="t" o:hr="t" fillcolor="#a0a0a0" stroked="f"/>
         </w:pict>
       </w:r>
     </w:p>
@@ -1758,7 +1758,7 @@
     <w:p>
       <w:r>
         <w:pict w14:anchorId="6BA6D6DF">
-          <v:rect id="_x0000_i1124" style="width:0;height:1.5pt" o:hralign="center" o:hrstd="t" o:hr="t" fillcolor="#a0a0a0" stroked="f"/>
+          <v:rect id="_x0000_i1034" style="width:0;height:1.5pt" o:hralign="center" o:hrstd="t" o:hr="t" fillcolor="#a0a0a0" stroked="f"/>
         </w:pict>
       </w:r>
     </w:p>
@@ -1912,7 +1912,7 @@
     <w:p>
       <w:r>
         <w:pict w14:anchorId="7A8E2072">
-          <v:rect id="_x0000_i1125" style="width:0;height:1.5pt" o:hralign="center" o:hrstd="t" o:hr="t" fillcolor="#a0a0a0" stroked="f"/>
+          <v:rect id="_x0000_i1035" style="width:0;height:1.5pt" o:hralign="center" o:hrstd="t" o:hr="t" fillcolor="#a0a0a0" stroked="f"/>
         </w:pict>
       </w:r>
     </w:p>
@@ -2025,7 +2025,7 @@
       <w:r>
         <w:lastRenderedPageBreak/>
         <w:pict w14:anchorId="397FA3EF">
-          <v:rect id="_x0000_i1126" style="width:0;height:1.5pt" o:hralign="center" o:hrstd="t" o:hr="t" fillcolor="#a0a0a0" stroked="f"/>
+          <v:rect id="_x0000_i1036" style="width:0;height:1.5pt" o:hralign="center" o:hrstd="t" o:hr="t" fillcolor="#a0a0a0" stroked="f"/>
         </w:pict>
       </w:r>
     </w:p>
@@ -2364,7 +2364,7 @@
     <w:p>
       <w:r>
         <w:pict w14:anchorId="70C0DEAA">
-          <v:rect id="_x0000_i1127" style="width:0;height:1.5pt" o:hralign="center" o:hrstd="t" o:hr="t" fillcolor="#a0a0a0" stroked="f"/>
+          <v:rect id="_x0000_i1037" style="width:0;height:1.5pt" o:hralign="center" o:hrstd="t" o:hr="t" fillcolor="#a0a0a0" stroked="f"/>
         </w:pict>
       </w:r>
     </w:p>
@@ -2543,7 +2543,7 @@
     <w:p>
       <w:r>
         <w:pict w14:anchorId="322B0D9B">
-          <v:rect id="_x0000_i1128" style="width:0;height:1.5pt" o:hralign="center" o:hrstd="t" o:hr="t" fillcolor="#a0a0a0" stroked="f"/>
+          <v:rect id="_x0000_i1038" style="width:0;height:1.5pt" o:hralign="center" o:hrstd="t" o:hr="t" fillcolor="#a0a0a0" stroked="f"/>
         </w:pict>
       </w:r>
     </w:p>
@@ -2731,7 +2731,7 @@
     <w:p>
       <w:r>
         <w:pict w14:anchorId="38B5B1E0">
-          <v:rect id="_x0000_i1129" style="width:0;height:1.5pt" o:hralign="center" o:hrstd="t" o:hr="t" fillcolor="#a0a0a0" stroked="f"/>
+          <v:rect id="_x0000_i1039" style="width:0;height:1.5pt" o:hralign="center" o:hrstd="t" o:hr="t" fillcolor="#a0a0a0" stroked="f"/>
         </w:pict>
       </w:r>
     </w:p>
@@ -3645,7 +3645,7 @@
     <w:p>
       <w:r>
         <w:pict w14:anchorId="0319F7B1">
-          <v:rect id="_x0000_i1229" style="width:0;height:1.5pt" o:hralign="center" o:hrstd="t" o:hr="t" fillcolor="#a0a0a0" stroked="f"/>
+          <v:rect id="_x0000_i1040" style="width:0;height:1.5pt" o:hralign="center" o:hrstd="t" o:hr="t" fillcolor="#a0a0a0" stroked="f"/>
         </w:pict>
       </w:r>
     </w:p>
@@ -3757,7 +3757,7 @@
     <w:p>
       <w:r>
         <w:pict w14:anchorId="163FE438">
-          <v:rect id="_x0000_i1230" style="width:0;height:1.5pt" o:hralign="center" o:hrstd="t" o:hr="t" fillcolor="#a0a0a0" stroked="f"/>
+          <v:rect id="_x0000_i1041" style="width:0;height:1.5pt" o:hralign="center" o:hrstd="t" o:hr="t" fillcolor="#a0a0a0" stroked="f"/>
         </w:pict>
       </w:r>
     </w:p>
@@ -3855,6 +3855,12 @@
         </w:rPr>
         <w:t>pour lire le texte.</w:t>
       </w:r>
+      <w:r>
+        <w:rPr>
+          <w:lang w:val="fr-FR"/>
+        </w:rPr>
+        <w:t> ;</w:t>
+      </w:r>
     </w:p>
     <w:p>
       <w:pPr>
@@ -3975,7 +3981,7 @@
     <w:p>
       <w:r>
         <w:pict w14:anchorId="2C23048D">
-          <v:rect id="_x0000_i1231" style="width:0;height:1.5pt" o:hralign="center" o:hrstd="t" o:hr="t" fillcolor="#a0a0a0" stroked="f"/>
+          <v:rect id="_x0000_i1042" style="width:0;height:1.5pt" o:hralign="center" o:hrstd="t" o:hr="t" fillcolor="#a0a0a0" stroked="f"/>
         </w:pict>
       </w:r>
     </w:p>
@@ -4239,7 +4245,7 @@
     <w:p>
       <w:r>
         <w:pict w14:anchorId="56725549">
-          <v:rect id="_x0000_i1232" style="width:0;height:1.5pt" o:hralign="center" o:hrstd="t" o:hr="t" fillcolor="#a0a0a0" stroked="f"/>
+          <v:rect id="_x0000_i1043" style="width:0;height:1.5pt" o:hralign="center" o:hrstd="t" o:hr="t" fillcolor="#a0a0a0" stroked="f"/>
         </w:pict>
       </w:r>
     </w:p>
@@ -4498,7 +4504,7 @@
     <w:p>
       <w:r>
         <w:pict w14:anchorId="7B3EB6F8">
-          <v:rect id="_x0000_i1233" style="width:0;height:1.5pt" o:hralign="center" o:hrstd="t" o:hr="t" fillcolor="#a0a0a0" stroked="f"/>
+          <v:rect id="_x0000_i1044" style="width:0;height:1.5pt" o:hralign="center" o:hrstd="t" o:hr="t" fillcolor="#a0a0a0" stroked="f"/>
         </w:pict>
       </w:r>
     </w:p>
@@ -4717,7 +4723,7 @@
     <w:p>
       <w:r>
         <w:pict w14:anchorId="2FFE460D">
-          <v:rect id="_x0000_i1234" style="width:0;height:1.5pt" o:hralign="center" o:hrstd="t" o:hr="t" fillcolor="#a0a0a0" stroked="f"/>
+          <v:rect id="_x0000_i1045" style="width:0;height:1.5pt" o:hralign="center" o:hrstd="t" o:hr="t" fillcolor="#a0a0a0" stroked="f"/>
         </w:pict>
       </w:r>
     </w:p>
@@ -4896,7 +4902,7 @@
     <w:p>
       <w:r>
         <w:pict w14:anchorId="48D2213C">
-          <v:rect id="_x0000_i1235" style="width:0;height:1.5pt" o:hralign="center" o:hrstd="t" o:hr="t" fillcolor="#a0a0a0" stroked="f"/>
+          <v:rect id="_x0000_i1046" style="width:0;height:1.5pt" o:hralign="center" o:hrstd="t" o:hr="t" fillcolor="#a0a0a0" stroked="f"/>
         </w:pict>
       </w:r>
     </w:p>
@@ -5045,7 +5051,7 @@
     <w:p>
       <w:r>
         <w:pict w14:anchorId="4051E3B2">
-          <v:rect id="_x0000_i1236" style="width:0;height:1.5pt" o:hralign="center" o:hrstd="t" o:hr="t" fillcolor="#a0a0a0" stroked="f"/>
+          <v:rect id="_x0000_i1047" style="width:0;height:1.5pt" o:hralign="center" o:hrstd="t" o:hr="t" fillcolor="#a0a0a0" stroked="f"/>
         </w:pict>
       </w:r>
     </w:p>
@@ -5121,7 +5127,7 @@
     <w:p>
       <w:r>
         <w:pict w14:anchorId="209908E5">
-          <v:rect id="_x0000_i1237" style="width:0;height:1.5pt" o:hralign="center" o:hrstd="t" o:hr="t" fillcolor="#a0a0a0" stroked="f"/>
+          <v:rect id="_x0000_i1048" style="width:0;height:1.5pt" o:hralign="center" o:hrstd="t" o:hr="t" fillcolor="#a0a0a0" stroked="f"/>
         </w:pict>
       </w:r>
     </w:p>
@@ -5184,7 +5190,7 @@
     <w:p>
       <w:r>
         <w:pict w14:anchorId="29F6FBE1">
-          <v:rect id="_x0000_i1238" style="width:0;height:1.5pt" o:hralign="center" o:hrstd="t" o:hr="t" fillcolor="#a0a0a0" stroked="f"/>
+          <v:rect id="_x0000_i1049" style="width:0;height:1.5pt" o:hralign="center" o:hrstd="t" o:hr="t" fillcolor="#a0a0a0" stroked="f"/>
         </w:pict>
       </w:r>
     </w:p>
@@ -5365,7 +5371,7 @@
     <w:p>
       <w:r>
         <w:pict w14:anchorId="0329B38B">
-          <v:rect id="_x0000_i1239" style="width:0;height:1.5pt" o:hralign="center" o:hrstd="t" o:hr="t" fillcolor="#a0a0a0" stroked="f"/>
+          <v:rect id="_x0000_i1050" style="width:0;height:1.5pt" o:hralign="center" o:hrstd="t" o:hr="t" fillcolor="#a0a0a0" stroked="f"/>
         </w:pict>
       </w:r>
     </w:p>
@@ -5493,7 +5499,7 @@
     <w:p>
       <w:r>
         <w:pict w14:anchorId="71D995F0">
-          <v:rect id="_x0000_i1240" style="width:0;height:1.5pt" o:hralign="center" o:hrstd="t" o:hr="t" fillcolor="#a0a0a0" stroked="f"/>
+          <v:rect id="_x0000_i1051" style="width:0;height:1.5pt" o:hralign="center" o:hrstd="t" o:hr="t" fillcolor="#a0a0a0" stroked="f"/>
         </w:pict>
       </w:r>
     </w:p>
@@ -5661,7 +5667,7 @@
       <w:r>
         <w:lastRenderedPageBreak/>
         <w:pict w14:anchorId="435A0C1B">
-          <v:rect id="_x0000_i1241" style="width:0;height:1.5pt" o:hralign="center" o:hrstd="t" o:hr="t" fillcolor="#a0a0a0" stroked="f"/>
+          <v:rect id="_x0000_i1052" style="width:0;height:1.5pt" o:hralign="center" o:hrstd="t" o:hr="t" fillcolor="#a0a0a0" stroked="f"/>
         </w:pict>
       </w:r>
     </w:p>
@@ -5854,7 +5860,7 @@
     <w:p>
       <w:r>
         <w:pict w14:anchorId="708F3236">
-          <v:rect id="_x0000_i1242" style="width:0;height:1.5pt" o:hralign="center" o:hrstd="t" o:hr="t" fillcolor="#a0a0a0" stroked="f"/>
+          <v:rect id="_x0000_i1053" style="width:0;height:1.5pt" o:hralign="center" o:hrstd="t" o:hr="t" fillcolor="#a0a0a0" stroked="f"/>
         </w:pict>
       </w:r>
     </w:p>
@@ -6838,7 +6844,7 @@
       </w:pPr>
       <w:r>
         <w:pict w14:anchorId="76504349">
-          <v:rect id="_x0000_i1365" style="width:0;height:1.5pt" o:hralign="center" o:hrstd="t" o:hr="t" fillcolor="#a0a0a0" stroked="f"/>
+          <v:rect id="_x0000_i1054" style="width:0;height:1.5pt" o:hralign="center" o:hrstd="t" o:hr="t" fillcolor="#a0a0a0" stroked="f"/>
         </w:pict>
       </w:r>
     </w:p>
@@ -7091,7 +7097,7 @@
       </w:pPr>
       <w:r>
         <w:pict w14:anchorId="00324E06">
-          <v:rect id="_x0000_i1366" style="width:0;height:1.5pt" o:hralign="center" o:hrstd="t" o:hr="t" fillcolor="#a0a0a0" stroked="f"/>
+          <v:rect id="_x0000_i1055" style="width:0;height:1.5pt" o:hralign="center" o:hrstd="t" o:hr="t" fillcolor="#a0a0a0" stroked="f"/>
         </w:pict>
       </w:r>
     </w:p>
@@ -7219,7 +7225,7 @@
       </w:pPr>
       <w:r>
         <w:pict w14:anchorId="24E7E205">
-          <v:rect id="_x0000_i1367" style="width:0;height:1.5pt" o:hralign="center" o:hrstd="t" o:hr="t" fillcolor="#a0a0a0" stroked="f"/>
+          <v:rect id="_x0000_i1056" style="width:0;height:1.5pt" o:hralign="center" o:hrstd="t" o:hr="t" fillcolor="#a0a0a0" stroked="f"/>
         </w:pict>
       </w:r>
     </w:p>
@@ -7398,7 +7404,7 @@
       </w:pPr>
       <w:r>
         <w:pict w14:anchorId="6ED6A93D">
-          <v:rect id="_x0000_i1368" style="width:0;height:1.5pt" o:hralign="center" o:hrstd="t" o:hr="t" fillcolor="#a0a0a0" stroked="f"/>
+          <v:rect id="_x0000_i1057" style="width:0;height:1.5pt" o:hralign="center" o:hrstd="t" o:hr="t" fillcolor="#a0a0a0" stroked="f"/>
         </w:pict>
       </w:r>
     </w:p>
@@ -7642,7 +7648,7 @@
       </w:pPr>
       <w:r>
         <w:pict w14:anchorId="3C278611">
-          <v:rect id="_x0000_i1369" style="width:0;height:1.5pt" o:hralign="center" o:hrstd="t" o:hr="t" fillcolor="#a0a0a0" stroked="f"/>
+          <v:rect id="_x0000_i1058" style="width:0;height:1.5pt" o:hralign="center" o:hrstd="t" o:hr="t" fillcolor="#a0a0a0" stroked="f"/>
         </w:pict>
       </w:r>
     </w:p>
@@ -7914,7 +7920,7 @@
       </w:pPr>
       <w:r>
         <w:pict w14:anchorId="534F0C39">
-          <v:rect id="_x0000_i1370" style="width:0;height:1.5pt" o:hralign="center" o:hrstd="t" o:hr="t" fillcolor="#a0a0a0" stroked="f"/>
+          <v:rect id="_x0000_i1059" style="width:0;height:1.5pt" o:hralign="center" o:hrstd="t" o:hr="t" fillcolor="#a0a0a0" stroked="f"/>
         </w:pict>
       </w:r>
     </w:p>
@@ -8097,7 +8103,7 @@
       </w:pPr>
       <w:r>
         <w:pict w14:anchorId="1A94BC94">
-          <v:rect id="_x0000_i1371" style="width:0;height:1.5pt" o:hralign="center" o:hrstd="t" o:hr="t" fillcolor="#a0a0a0" stroked="f"/>
+          <v:rect id="_x0000_i1060" style="width:0;height:1.5pt" o:hralign="center" o:hrstd="t" o:hr="t" fillcolor="#a0a0a0" stroked="f"/>
         </w:pict>
       </w:r>
     </w:p>
@@ -8411,7 +8417,7 @@
       </w:pPr>
       <w:r>
         <w:pict w14:anchorId="57133362">
-          <v:rect id="_x0000_i1372" style="width:0;height:1.5pt" o:hralign="center" o:hrstd="t" o:hr="t" fillcolor="#a0a0a0" stroked="f"/>
+          <v:rect id="_x0000_i1061" style="width:0;height:1.5pt" o:hralign="center" o:hrstd="t" o:hr="t" fillcolor="#a0a0a0" stroked="f"/>
         </w:pict>
       </w:r>
     </w:p>
@@ -8560,7 +8566,7 @@
       </w:pPr>
       <w:r>
         <w:pict w14:anchorId="16A72A98">
-          <v:rect id="_x0000_i1373" style="width:0;height:1.5pt" o:hralign="center" o:hrstd="t" o:hr="t" fillcolor="#a0a0a0" stroked="f"/>
+          <v:rect id="_x0000_i1062" style="width:0;height:1.5pt" o:hralign="center" o:hrstd="t" o:hr="t" fillcolor="#a0a0a0" stroked="f"/>
         </w:pict>
       </w:r>
     </w:p>
@@ -8672,7 +8678,7 @@
       </w:pPr>
       <w:r>
         <w:pict w14:anchorId="2619C397">
-          <v:rect id="_x0000_i1374" style="width:0;height:1.5pt" o:hralign="center" o:hrstd="t" o:hr="t" fillcolor="#a0a0a0" stroked="f"/>
+          <v:rect id="_x0000_i1063" style="width:0;height:1.5pt" o:hralign="center" o:hrstd="t" o:hr="t" fillcolor="#a0a0a0" stroked="f"/>
         </w:pict>
       </w:r>
     </w:p>
@@ -8728,7 +8734,7 @@
       </w:pPr>
       <w:r>
         <w:pict w14:anchorId="45713E70">
-          <v:rect id="_x0000_i1375" style="width:0;height:1.5pt" o:hralign="center" o:hrstd="t" o:hr="t" fillcolor="#a0a0a0" stroked="f"/>
+          <v:rect id="_x0000_i1064" style="width:0;height:1.5pt" o:hralign="center" o:hrstd="t" o:hr="t" fillcolor="#a0a0a0" stroked="f"/>
         </w:pict>
       </w:r>
     </w:p>
@@ -8792,7 +8798,7 @@
       </w:pPr>
       <w:r>
         <w:pict w14:anchorId="24752C93">
-          <v:rect id="_x0000_i1376" style="width:0;height:1.5pt" o:hralign="center" o:hrstd="t" o:hr="t" fillcolor="#a0a0a0" stroked="f"/>
+          <v:rect id="_x0000_i1065" style="width:0;height:1.5pt" o:hralign="center" o:hrstd="t" o:hr="t" fillcolor="#a0a0a0" stroked="f"/>
         </w:pict>
       </w:r>
     </w:p>
@@ -8947,7 +8953,7 @@
       </w:pPr>
       <w:r>
         <w:pict w14:anchorId="3E3BCDBB">
-          <v:rect id="_x0000_i1377" style="width:0;height:1.5pt" o:hralign="center" o:hrstd="t" o:hr="t" fillcolor="#a0a0a0" stroked="f"/>
+          <v:rect id="_x0000_i1066" style="width:0;height:1.5pt" o:hralign="center" o:hrstd="t" o:hr="t" fillcolor="#a0a0a0" stroked="f"/>
         </w:pict>
       </w:r>
     </w:p>
@@ -9073,7 +9079,7 @@
       </w:pPr>
       <w:r>
         <w:pict w14:anchorId="17505FF8">
-          <v:rect id="_x0000_i1378" style="width:0;height:1.5pt" o:hralign="center" o:hrstd="t" o:hr="t" fillcolor="#a0a0a0" stroked="f"/>
+          <v:rect id="_x0000_i1067" style="width:0;height:1.5pt" o:hralign="center" o:hrstd="t" o:hr="t" fillcolor="#a0a0a0" stroked="f"/>
         </w:pict>
       </w:r>
     </w:p>
@@ -9215,7 +9221,7 @@
       <w:r>
         <w:lastRenderedPageBreak/>
         <w:pict w14:anchorId="017E6931">
-          <v:rect id="_x0000_i1379" style="width:0;height:1.5pt" o:hralign="center" o:hrstd="t" o:hr="t" fillcolor="#a0a0a0" stroked="f"/>
+          <v:rect id="_x0000_i1068" style="width:0;height:1.5pt" o:hralign="center" o:hrstd="t" o:hr="t" fillcolor="#a0a0a0" stroked="f"/>
         </w:pict>
       </w:r>
     </w:p>
@@ -9325,7 +9331,7 @@
       </w:pPr>
       <w:r>
         <w:pict w14:anchorId="699623D6">
-          <v:rect id="_x0000_i1380" style="width:0;height:1.5pt" o:hralign="center" o:hrstd="t" o:hr="t" fillcolor="#a0a0a0" stroked="f"/>
+          <v:rect id="_x0000_i1069" style="width:0;height:1.5pt" o:hralign="center" o:hrstd="t" o:hr="t" fillcolor="#a0a0a0" stroked="f"/>
         </w:pict>
       </w:r>
     </w:p>
@@ -9529,7 +9535,7 @@
       <w:r>
         <w:lastRenderedPageBreak/>
         <w:pict w14:anchorId="3FE9BAEF">
-          <v:rect id="_x0000_i1381" style="width:0;height:1.5pt" o:hralign="center" o:hrstd="t" o:hr="t" fillcolor="#a0a0a0" stroked="f"/>
+          <v:rect id="_x0000_i1070" style="width:0;height:1.5pt" o:hralign="center" o:hrstd="t" o:hr="t" fillcolor="#a0a0a0" stroked="f"/>
         </w:pict>
       </w:r>
     </w:p>
@@ -9857,7 +9863,7 @@
       </w:pPr>
       <w:r>
         <w:pict w14:anchorId="04B5413D">
-          <v:rect id="_x0000_i1382" style="width:0;height:1.5pt" o:hralign="center" o:hrstd="t" o:hr="t" fillcolor="#a0a0a0" stroked="f"/>
+          <v:rect id="_x0000_i1071" style="width:0;height:1.5pt" o:hralign="center" o:hrstd="t" o:hr="t" fillcolor="#a0a0a0" stroked="f"/>
         </w:pict>
       </w:r>
     </w:p>
@@ -10609,7 +10615,7 @@
       </w:pPr>
       <w:r>
         <w:pict w14:anchorId="6CC3354E">
-          <v:rect id="_x0000_i1503" style="width:0;height:1.5pt" o:hralign="center" o:hrstd="t" o:hr="t" fillcolor="#a0a0a0" stroked="f"/>
+          <v:rect id="_x0000_i1072" style="width:0;height:1.5pt" o:hralign="center" o:hrstd="t" o:hr="t" fillcolor="#a0a0a0" stroked="f"/>
         </w:pict>
       </w:r>
     </w:p>
@@ -10846,7 +10852,7 @@
       </w:pPr>
       <w:r>
         <w:pict w14:anchorId="17E0E182">
-          <v:rect id="_x0000_i1504" style="width:0;height:1.5pt" o:hralign="center" o:hrstd="t" o:hr="t" fillcolor="#a0a0a0" stroked="f"/>
+          <v:rect id="_x0000_i1073" style="width:0;height:1.5pt" o:hralign="center" o:hrstd="t" o:hr="t" fillcolor="#a0a0a0" stroked="f"/>
         </w:pict>
       </w:r>
     </w:p>
@@ -11076,7 +11082,7 @@
       </w:pPr>
       <w:r>
         <w:pict w14:anchorId="2937F419">
-          <v:rect id="_x0000_i1505" style="width:0;height:1.5pt" o:hralign="center" o:hrstd="t" o:hr="t" fillcolor="#a0a0a0" stroked="f"/>
+          <v:rect id="_x0000_i1074" style="width:0;height:1.5pt" o:hralign="center" o:hrstd="t" o:hr="t" fillcolor="#a0a0a0" stroked="f"/>
         </w:pict>
       </w:r>
     </w:p>
@@ -11450,7 +11456,7 @@
       </w:pPr>
       <w:r>
         <w:pict w14:anchorId="629C1B94">
-          <v:rect id="_x0000_i1506" style="width:0;height:1.5pt" o:hralign="center" o:hrstd="t" o:hr="t" fillcolor="#a0a0a0" stroked="f"/>
+          <v:rect id="_x0000_i1075" style="width:0;height:1.5pt" o:hralign="center" o:hrstd="t" o:hr="t" fillcolor="#a0a0a0" stroked="f"/>
         </w:pict>
       </w:r>
     </w:p>
@@ -11619,7 +11625,7 @@
       </w:pPr>
       <w:r>
         <w:pict w14:anchorId="19DAD4F5">
-          <v:rect id="_x0000_i1507" style="width:0;height:1.5pt" o:hralign="center" o:hrstd="t" o:hr="t" fillcolor="#a0a0a0" stroked="f"/>
+          <v:rect id="_x0000_i1076" style="width:0;height:1.5pt" o:hralign="center" o:hrstd="t" o:hr="t" fillcolor="#a0a0a0" stroked="f"/>
         </w:pict>
       </w:r>
     </w:p>
@@ -11827,7 +11833,7 @@
       </w:pPr>
       <w:r>
         <w:pict w14:anchorId="7B288CD3">
-          <v:rect id="_x0000_i1508" style="width:0;height:1.5pt" o:hralign="center" o:hrstd="t" o:hr="t" fillcolor="#a0a0a0" stroked="f"/>
+          <v:rect id="_x0000_i1077" style="width:0;height:1.5pt" o:hralign="center" o:hrstd="t" o:hr="t" fillcolor="#a0a0a0" stroked="f"/>
         </w:pict>
       </w:r>
     </w:p>
@@ -12107,7 +12113,7 @@
       </w:pPr>
       <w:r>
         <w:pict w14:anchorId="5DAF61FA">
-          <v:rect id="_x0000_i1509" style="width:0;height:1.5pt" o:hralign="center" o:hrstd="t" o:hr="t" fillcolor="#a0a0a0" stroked="f"/>
+          <v:rect id="_x0000_i1078" style="width:0;height:1.5pt" o:hralign="center" o:hrstd="t" o:hr="t" fillcolor="#a0a0a0" stroked="f"/>
         </w:pict>
       </w:r>
     </w:p>
@@ -12191,7 +12197,7 @@
       </w:pPr>
       <w:r>
         <w:pict w14:anchorId="2C4EA03E">
-          <v:rect id="_x0000_i1510" style="width:0;height:1.5pt" o:hralign="center" o:hrstd="t" o:hr="t" fillcolor="#a0a0a0" stroked="f"/>
+          <v:rect id="_x0000_i1079" style="width:0;height:1.5pt" o:hralign="center" o:hrstd="t" o:hr="t" fillcolor="#a0a0a0" stroked="f"/>
         </w:pict>
       </w:r>
     </w:p>
@@ -12372,7 +12378,7 @@
       </w:pPr>
       <w:r>
         <w:pict w14:anchorId="5F663DFE">
-          <v:rect id="_x0000_i1511" style="width:0;height:1.5pt" o:hralign="center" o:hrstd="t" o:hr="t" fillcolor="#a0a0a0" stroked="f"/>
+          <v:rect id="_x0000_i1080" style="width:0;height:1.5pt" o:hralign="center" o:hrstd="t" o:hr="t" fillcolor="#a0a0a0" stroked="f"/>
         </w:pict>
       </w:r>
     </w:p>
@@ -12433,7 +12439,7 @@
       </w:pPr>
       <w:r>
         <w:pict w14:anchorId="70652072">
-          <v:rect id="_x0000_i1512" style="width:0;height:1.5pt" o:hralign="center" o:hrstd="t" o:hr="t" fillcolor="#a0a0a0" stroked="f"/>
+          <v:rect id="_x0000_i1081" style="width:0;height:1.5pt" o:hralign="center" o:hrstd="t" o:hr="t" fillcolor="#a0a0a0" stroked="f"/>
         </w:pict>
       </w:r>
     </w:p>
@@ -12502,7 +12508,7 @@
       </w:pPr>
       <w:r>
         <w:pict w14:anchorId="729ABA2F">
-          <v:rect id="_x0000_i1513" style="width:0;height:1.5pt" o:hralign="center" o:hrstd="t" o:hr="t" fillcolor="#a0a0a0" stroked="f"/>
+          <v:rect id="_x0000_i1082" style="width:0;height:1.5pt" o:hralign="center" o:hrstd="t" o:hr="t" fillcolor="#a0a0a0" stroked="f"/>
         </w:pict>
       </w:r>
     </w:p>
@@ -12588,7 +12594,7 @@
       </w:pPr>
       <w:r>
         <w:pict w14:anchorId="34E5982F">
-          <v:rect id="_x0000_i1514" style="width:0;height:1.5pt" o:hralign="center" o:hrstd="t" o:hr="t" fillcolor="#a0a0a0" stroked="f"/>
+          <v:rect id="_x0000_i1083" style="width:0;height:1.5pt" o:hralign="center" o:hrstd="t" o:hr="t" fillcolor="#a0a0a0" stroked="f"/>
         </w:pict>
       </w:r>
     </w:p>
@@ -12834,7 +12840,7 @@
       </w:pPr>
       <w:r>
         <w:pict w14:anchorId="670C0755">
-          <v:rect id="_x0000_i1515" style="width:0;height:1.5pt" o:hralign="center" o:hrstd="t" o:hr="t" fillcolor="#a0a0a0" stroked="f"/>
+          <v:rect id="_x0000_i1084" style="width:0;height:1.5pt" o:hralign="center" o:hrstd="t" o:hr="t" fillcolor="#a0a0a0" stroked="f"/>
         </w:pict>
       </w:r>
     </w:p>
@@ -13072,7 +13078,7 @@
       </w:pPr>
       <w:r>
         <w:pict w14:anchorId="538233ED">
-          <v:rect id="_x0000_i1516" style="width:0;height:1.5pt" o:hralign="center" o:hrstd="t" o:hr="t" fillcolor="#a0a0a0" stroked="f"/>
+          <v:rect id="_x0000_i1085" style="width:0;height:1.5pt" o:hralign="center" o:hrstd="t" o:hr="t" fillcolor="#a0a0a0" stroked="f"/>
         </w:pict>
       </w:r>
     </w:p>
@@ -13394,7 +13400,7 @@
       </w:pPr>
       <w:r>
         <w:pict w14:anchorId="450EE217">
-          <v:rect id="_x0000_i1517" style="width:0;height:1.5pt" o:hralign="center" o:hrstd="t" o:hr="t" fillcolor="#a0a0a0" stroked="f"/>
+          <v:rect id="_x0000_i1086" style="width:0;height:1.5pt" o:hralign="center" o:hrstd="t" o:hr="t" fillcolor="#a0a0a0" stroked="f"/>
         </w:pict>
       </w:r>
     </w:p>
@@ -13584,7 +13590,7 @@
       </w:pPr>
       <w:r>
         <w:pict w14:anchorId="670461C6">
-          <v:rect id="_x0000_i1518" style="width:0;height:1.5pt" o:hralign="center" o:hrstd="t" o:hr="t" fillcolor="#a0a0a0" stroked="f"/>
+          <v:rect id="_x0000_i1087" style="width:0;height:1.5pt" o:hralign="center" o:hrstd="t" o:hr="t" fillcolor="#a0a0a0" stroked="f"/>
         </w:pict>
       </w:r>
     </w:p>
@@ -13816,7 +13822,7 @@
       </w:pPr>
       <w:r>
         <w:pict w14:anchorId="2E27C578">
-          <v:rect id="_x0000_i1519" style="width:0;height:1.5pt" o:hralign="center" o:hrstd="t" o:hr="t" fillcolor="#a0a0a0" stroked="f"/>
+          <v:rect id="_x0000_i1088" style="width:0;height:1.5pt" o:hralign="center" o:hrstd="t" o:hr="t" fillcolor="#a0a0a0" stroked="f"/>
         </w:pict>
       </w:r>
     </w:p>
@@ -14228,7 +14234,7 @@
       <w:r>
         <w:lastRenderedPageBreak/>
         <w:pict w14:anchorId="2BAB18D0">
-          <v:rect id="_x0000_i1753" style="width:0;height:1.5pt" o:hralign="center" o:hrstd="t" o:hr="t" fillcolor="#a0a0a0" stroked="f"/>
+          <v:rect id="_x0000_i1089" style="width:0;height:1.5pt" o:hralign="center" o:hrstd="t" o:hr="t" fillcolor="#a0a0a0" stroked="f"/>
         </w:pict>
       </w:r>
     </w:p>
@@ -14500,7 +14506,7 @@
       </w:pPr>
       <w:r>
         <w:pict w14:anchorId="5DE3AD97">
-          <v:rect id="_x0000_i1754" style="width:0;height:1.5pt" o:hralign="center" o:hrstd="t" o:hr="t" fillcolor="#a0a0a0" stroked="f"/>
+          <v:rect id="_x0000_i1090" style="width:0;height:1.5pt" o:hralign="center" o:hrstd="t" o:hr="t" fillcolor="#a0a0a0" stroked="f"/>
         </w:pict>
       </w:r>
     </w:p>
@@ -14584,7 +14590,7 @@
       </w:pPr>
       <w:r>
         <w:pict w14:anchorId="02876562">
-          <v:rect id="_x0000_i1755" style="width:0;height:1.5pt" o:hralign="center" o:hrstd="t" o:hr="t" fillcolor="#a0a0a0" stroked="f"/>
+          <v:rect id="_x0000_i1091" style="width:0;height:1.5pt" o:hralign="center" o:hrstd="t" o:hr="t" fillcolor="#a0a0a0" stroked="f"/>
         </w:pict>
       </w:r>
     </w:p>
@@ -14623,7 +14629,7 @@
       </w:pPr>
       <w:r>
         <w:pict w14:anchorId="1F4906D1">
-          <v:rect id="_x0000_i1756" style="width:0;height:1.5pt" o:hralign="center" o:hrstd="t" o:hr="t" fillcolor="#a0a0a0" stroked="f"/>
+          <v:rect id="_x0000_i1092" style="width:0;height:1.5pt" o:hralign="center" o:hrstd="t" o:hr="t" fillcolor="#a0a0a0" stroked="f"/>
         </w:pict>
       </w:r>
     </w:p>
@@ -14661,7 +14667,7 @@
       </w:pPr>
       <w:r>
         <w:pict w14:anchorId="4F974BD4">
-          <v:rect id="_x0000_i1757" style="width:0;height:1.5pt" o:hralign="center" o:hrstd="t" o:hr="t" fillcolor="#a0a0a0" stroked="f"/>
+          <v:rect id="_x0000_i1093" style="width:0;height:1.5pt" o:hralign="center" o:hrstd="t" o:hr="t" fillcolor="#a0a0a0" stroked="f"/>
         </w:pict>
       </w:r>
     </w:p>
@@ -14699,7 +14705,7 @@
       </w:pPr>
       <w:r>
         <w:pict w14:anchorId="7A44F4EE">
-          <v:rect id="_x0000_i1758" style="width:0;height:1.5pt" o:hralign="center" o:hrstd="t" o:hr="t" fillcolor="#a0a0a0" stroked="f"/>
+          <v:rect id="_x0000_i1094" style="width:0;height:1.5pt" o:hralign="center" o:hrstd="t" o:hr="t" fillcolor="#a0a0a0" stroked="f"/>
         </w:pict>
       </w:r>
     </w:p>
@@ -14833,7 +14839,7 @@
       </w:pPr>
       <w:r>
         <w:pict w14:anchorId="42754466">
-          <v:rect id="_x0000_i1759" style="width:0;height:1.5pt" o:hralign="center" o:hrstd="t" o:hr="t" fillcolor="#a0a0a0" stroked="f"/>
+          <v:rect id="_x0000_i1095" style="width:0;height:1.5pt" o:hralign="center" o:hrstd="t" o:hr="t" fillcolor="#a0a0a0" stroked="f"/>
         </w:pict>
       </w:r>
     </w:p>
@@ -14929,7 +14935,7 @@
       </w:pPr>
       <w:r>
         <w:pict w14:anchorId="27CDD34D">
-          <v:rect id="_x0000_i1760" style="width:0;height:1.5pt" o:hralign="center" o:hrstd="t" o:hr="t" fillcolor="#a0a0a0" stroked="f"/>
+          <v:rect id="_x0000_i1096" style="width:0;height:1.5pt" o:hralign="center" o:hrstd="t" o:hr="t" fillcolor="#a0a0a0" stroked="f"/>
         </w:pict>
       </w:r>
     </w:p>
@@ -15067,7 +15073,7 @@
       </w:pPr>
       <w:r>
         <w:pict w14:anchorId="1E2FE713">
-          <v:rect id="_x0000_i1761" style="width:0;height:1.5pt" o:hralign="center" o:hrstd="t" o:hr="t" fillcolor="#a0a0a0" stroked="f"/>
+          <v:rect id="_x0000_i1097" style="width:0;height:1.5pt" o:hralign="center" o:hrstd="t" o:hr="t" fillcolor="#a0a0a0" stroked="f"/>
         </w:pict>
       </w:r>
     </w:p>
@@ -15137,7 +15143,7 @@
       </w:pPr>
       <w:r>
         <w:pict w14:anchorId="2EC07CED">
-          <v:rect id="_x0000_i1762" style="width:0;height:1.5pt" o:hralign="center" o:hrstd="t" o:hr="t" fillcolor="#a0a0a0" stroked="f"/>
+          <v:rect id="_x0000_i1098" style="width:0;height:1.5pt" o:hralign="center" o:hrstd="t" o:hr="t" fillcolor="#a0a0a0" stroked="f"/>
         </w:pict>
       </w:r>
     </w:p>
@@ -15171,7 +15177,7 @@
       </w:pPr>
       <w:r>
         <w:pict w14:anchorId="29854C57">
-          <v:rect id="_x0000_i1763" style="width:0;height:1.5pt" o:hralign="center" o:hrstd="t" o:hr="t" fillcolor="#a0a0a0" stroked="f"/>
+          <v:rect id="_x0000_i1099" style="width:0;height:1.5pt" o:hralign="center" o:hrstd="t" o:hr="t" fillcolor="#a0a0a0" stroked="f"/>
         </w:pict>
       </w:r>
     </w:p>
@@ -15410,7 +15416,7 @@
       </w:pPr>
       <w:r>
         <w:pict w14:anchorId="79CE80F1">
-          <v:rect id="_x0000_i1764" style="width:0;height:1.5pt" o:hralign="center" o:hrstd="t" o:hr="t" fillcolor="#a0a0a0" stroked="f"/>
+          <v:rect id="_x0000_i1100" style="width:0;height:1.5pt" o:hralign="center" o:hrstd="t" o:hr="t" fillcolor="#a0a0a0" stroked="f"/>
         </w:pict>
       </w:r>
     </w:p>
@@ -15592,7 +15598,7 @@
       </w:pPr>
       <w:r>
         <w:pict w14:anchorId="02358781">
-          <v:rect id="_x0000_i1765" style="width:0;height:1.5pt" o:hralign="center" o:hrstd="t" o:hr="t" fillcolor="#a0a0a0" stroked="f"/>
+          <v:rect id="_x0000_i1101" style="width:0;height:1.5pt" o:hralign="center" o:hrstd="t" o:hr="t" fillcolor="#a0a0a0" stroked="f"/>
         </w:pict>
       </w:r>
     </w:p>
@@ -15970,7 +15976,7 @@
       </w:pPr>
       <w:r>
         <w:pict w14:anchorId="5A9C0D58">
-          <v:rect id="_x0000_i1766" style="width:0;height:1.5pt" o:hralign="center" o:hrstd="t" o:hr="t" fillcolor="#a0a0a0" stroked="f"/>
+          <v:rect id="_x0000_i1102" style="width:0;height:1.5pt" o:hralign="center" o:hrstd="t" o:hr="t" fillcolor="#a0a0a0" stroked="f"/>
         </w:pict>
       </w:r>
     </w:p>
@@ -16166,7 +16172,7 @@
       </w:pPr>
       <w:r>
         <w:pict w14:anchorId="2FB8CCA1">
-          <v:rect id="_x0000_i1767" style="width:0;height:1.5pt" o:hralign="center" o:hrstd="t" o:hr="t" fillcolor="#a0a0a0" stroked="f"/>
+          <v:rect id="_x0000_i1103" style="width:0;height:1.5pt" o:hralign="center" o:hrstd="t" o:hr="t" fillcolor="#a0a0a0" stroked="f"/>
         </w:pict>
       </w:r>
     </w:p>
@@ -16293,7 +16299,7 @@
       </w:pPr>
       <w:r>
         <w:pict w14:anchorId="5F8EF6EE">
-          <v:rect id="_x0000_i1768" style="width:0;height:1.5pt" o:hralign="center" o:hrstd="t" o:hr="t" fillcolor="#a0a0a0" stroked="f"/>
+          <v:rect id="_x0000_i1104" style="width:0;height:1.5pt" o:hralign="center" o:hrstd="t" o:hr="t" fillcolor="#a0a0a0" stroked="f"/>
         </w:pict>
       </w:r>
     </w:p>
@@ -16549,7 +16555,7 @@
       </w:pPr>
       <w:r>
         <w:pict w14:anchorId="0AA3FC61">
-          <v:rect id="_x0000_i1769" style="width:0;height:1.5pt" o:hralign="center" o:hrstd="t" o:hr="t" fillcolor="#a0a0a0" stroked="f"/>
+          <v:rect id="_x0000_i1105" style="width:0;height:1.5pt" o:hralign="center" o:hrstd="t" o:hr="t" fillcolor="#a0a0a0" stroked="f"/>
         </w:pict>
       </w:r>
     </w:p>
@@ -16636,7 +16642,7 @@
       </w:pPr>
       <w:r>
         <w:pict w14:anchorId="5015C8A3">
-          <v:rect id="_x0000_i1770" style="width:0;height:1.5pt" o:hralign="center" o:hrstd="t" o:hr="t" fillcolor="#a0a0a0" stroked="f"/>
+          <v:rect id="_x0000_i1106" style="width:0;height:1.5pt" o:hralign="center" o:hrstd="t" o:hr="t" fillcolor="#a0a0a0" stroked="f"/>
         </w:pict>
       </w:r>
     </w:p>
@@ -16662,7 +16668,7 @@
       </w:pPr>
       <w:r>
         <w:pict w14:anchorId="6EBF0647">
-          <v:rect id="_x0000_i1771" style="width:0;height:1.5pt" o:hralign="center" o:hrstd="t" o:hr="t" fillcolor="#a0a0a0" stroked="f"/>
+          <v:rect id="_x0000_i1107" style="width:0;height:1.5pt" o:hralign="center" o:hrstd="t" o:hr="t" fillcolor="#a0a0a0" stroked="f"/>
         </w:pict>
       </w:r>
     </w:p>
@@ -16688,7 +16694,7 @@
       </w:pPr>
       <w:r>
         <w:pict w14:anchorId="3160D5AB">
-          <v:rect id="_x0000_i1772" style="width:0;height:1.5pt" o:hralign="center" o:hrstd="t" o:hr="t" fillcolor="#a0a0a0" stroked="f"/>
+          <v:rect id="_x0000_i1108" style="width:0;height:1.5pt" o:hralign="center" o:hrstd="t" o:hr="t" fillcolor="#a0a0a0" stroked="f"/>
         </w:pict>
       </w:r>
     </w:p>
@@ -16714,7 +16720,7 @@
       </w:pPr>
       <w:r>
         <w:pict w14:anchorId="6AF1CEF8">
-          <v:rect id="_x0000_i1773" style="width:0;height:1.5pt" o:hralign="center" o:hrstd="t" o:hr="t" fillcolor="#a0a0a0" stroked="f"/>
+          <v:rect id="_x0000_i1109" style="width:0;height:1.5pt" o:hralign="center" o:hrstd="t" o:hr="t" fillcolor="#a0a0a0" stroked="f"/>
         </w:pict>
       </w:r>
     </w:p>
@@ -16738,7 +16744,7 @@
       </w:pPr>
       <w:r>
         <w:pict w14:anchorId="599DF5BB">
-          <v:rect id="_x0000_i1774" style="width:0;height:1.5pt" o:hralign="center" o:hrstd="t" o:hr="t" fillcolor="#a0a0a0" stroked="f"/>
+          <v:rect id="_x0000_i1110" style="width:0;height:1.5pt" o:hralign="center" o:hrstd="t" o:hr="t" fillcolor="#a0a0a0" stroked="f"/>
         </w:pict>
       </w:r>
     </w:p>
@@ -16804,7 +16810,7 @@
       </w:pPr>
       <w:r>
         <w:pict w14:anchorId="1BE8E7AB">
-          <v:rect id="_x0000_i1775" style="width:0;height:1.5pt" o:hralign="center" o:hrstd="t" o:hr="t" fillcolor="#a0a0a0" stroked="f"/>
+          <v:rect id="_x0000_i1111" style="width:0;height:1.5pt" o:hralign="center" o:hrstd="t" o:hr="t" fillcolor="#a0a0a0" stroked="f"/>
         </w:pict>
       </w:r>
     </w:p>
@@ -16838,7 +16844,7 @@
       </w:pPr>
       <w:r>
         <w:pict w14:anchorId="510C51B4">
-          <v:rect id="_x0000_i1776" style="width:0;height:1.5pt" o:hralign="center" o:hrstd="t" o:hr="t" fillcolor="#a0a0a0" stroked="f"/>
+          <v:rect id="_x0000_i1112" style="width:0;height:1.5pt" o:hralign="center" o:hrstd="t" o:hr="t" fillcolor="#a0a0a0" stroked="f"/>
         </w:pict>
       </w:r>
     </w:p>
@@ -16873,7 +16879,7 @@
       </w:pPr>
       <w:r>
         <w:pict w14:anchorId="60A74446">
-          <v:rect id="_x0000_i1777" style="width:0;height:1.5pt" o:hralign="center" o:hrstd="t" o:hr="t" fillcolor="#a0a0a0" stroked="f"/>
+          <v:rect id="_x0000_i1113" style="width:0;height:1.5pt" o:hralign="center" o:hrstd="t" o:hr="t" fillcolor="#a0a0a0" stroked="f"/>
         </w:pict>
       </w:r>
     </w:p>
@@ -16907,7 +16913,7 @@
       </w:pPr>
       <w:r>
         <w:pict w14:anchorId="0BF32220">
-          <v:rect id="_x0000_i1778" style="width:0;height:1.5pt" o:hralign="center" o:hrstd="t" o:hr="t" fillcolor="#a0a0a0" stroked="f"/>
+          <v:rect id="_x0000_i1114" style="width:0;height:1.5pt" o:hralign="center" o:hrstd="t" o:hr="t" fillcolor="#a0a0a0" stroked="f"/>
         </w:pict>
       </w:r>
     </w:p>
@@ -16931,7 +16937,7 @@
       </w:pPr>
       <w:r>
         <w:pict w14:anchorId="0970E04C">
-          <v:rect id="_x0000_i1779" style="width:0;height:1.5pt" o:hralign="center" o:hrstd="t" o:hr="t" fillcolor="#a0a0a0" stroked="f"/>
+          <v:rect id="_x0000_i1115" style="width:0;height:1.5pt" o:hralign="center" o:hrstd="t" o:hr="t" fillcolor="#a0a0a0" stroked="f"/>
         </w:pict>
       </w:r>
     </w:p>
@@ -17017,7 +17023,7 @@
       </w:pPr>
       <w:r>
         <w:pict w14:anchorId="4A597FB4">
-          <v:rect id="_x0000_i1780" style="width:0;height:1.5pt" o:hralign="center" o:hrstd="t" o:hr="t" fillcolor="#a0a0a0" stroked="f"/>
+          <v:rect id="_x0000_i1116" style="width:0;height:1.5pt" o:hralign="center" o:hrstd="t" o:hr="t" fillcolor="#a0a0a0" stroked="f"/>
         </w:pict>
       </w:r>
     </w:p>
@@ -17071,7 +17077,7 @@
       </w:pPr>
       <w:r>
         <w:pict w14:anchorId="6684E9CA">
-          <v:rect id="_x0000_i1781" style="width:0;height:1.5pt" o:hralign="center" o:hrstd="t" o:hr="t" fillcolor="#a0a0a0" stroked="f"/>
+          <v:rect id="_x0000_i1117" style="width:0;height:1.5pt" o:hralign="center" o:hrstd="t" o:hr="t" fillcolor="#a0a0a0" stroked="f"/>
         </w:pict>
       </w:r>
     </w:p>
@@ -17097,7 +17103,7 @@
       </w:pPr>
       <w:r>
         <w:pict w14:anchorId="1409DC94">
-          <v:rect id="_x0000_i1782" style="width:0;height:1.5pt" o:hralign="center" o:hrstd="t" o:hr="t" fillcolor="#a0a0a0" stroked="f"/>
+          <v:rect id="_x0000_i1118" style="width:0;height:1.5pt" o:hralign="center" o:hrstd="t" o:hr="t" fillcolor="#a0a0a0" stroked="f"/>
         </w:pict>
       </w:r>
     </w:p>
@@ -17136,7 +17142,7 @@
       </w:pPr>
       <w:r>
         <w:pict w14:anchorId="595FC659">
-          <v:rect id="_x0000_i1783" style="width:0;height:1.5pt" o:hralign="center" o:hrstd="t" o:hr="t" fillcolor="#a0a0a0" stroked="f"/>
+          <v:rect id="_x0000_i1119" style="width:0;height:1.5pt" o:hralign="center" o:hrstd="t" o:hr="t" fillcolor="#a0a0a0" stroked="f"/>
         </w:pict>
       </w:r>
     </w:p>
@@ -17160,7 +17166,7 @@
       </w:pPr>
       <w:r>
         <w:pict w14:anchorId="4A492118">
-          <v:rect id="_x0000_i1784" style="width:0;height:1.5pt" o:hralign="center" o:hrstd="t" o:hr="t" fillcolor="#a0a0a0" stroked="f"/>
+          <v:rect id="_x0000_i1120" style="width:0;height:1.5pt" o:hralign="center" o:hrstd="t" o:hr="t" fillcolor="#a0a0a0" stroked="f"/>
         </w:pict>
       </w:r>
     </w:p>
@@ -17300,7 +17306,7 @@
       </w:pPr>
       <w:r>
         <w:pict w14:anchorId="72876A9C">
-          <v:rect id="_x0000_i1785" style="width:0;height:1.5pt" o:hralign="center" o:hrstd="t" o:hr="t" fillcolor="#a0a0a0" stroked="f"/>
+          <v:rect id="_x0000_i1121" style="width:0;height:1.5pt" o:hralign="center" o:hrstd="t" o:hr="t" fillcolor="#a0a0a0" stroked="f"/>
         </w:pict>
       </w:r>
     </w:p>
@@ -17334,7 +17340,7 @@
       </w:pPr>
       <w:r>
         <w:pict w14:anchorId="5011DB28">
-          <v:rect id="_x0000_i1786" style="width:0;height:1.5pt" o:hralign="center" o:hrstd="t" o:hr="t" fillcolor="#a0a0a0" stroked="f"/>
+          <v:rect id="_x0000_i1122" style="width:0;height:1.5pt" o:hralign="center" o:hrstd="t" o:hr="t" fillcolor="#a0a0a0" stroked="f"/>
         </w:pict>
       </w:r>
     </w:p>
@@ -17386,7 +17392,7 @@
       </w:pPr>
       <w:r>
         <w:pict w14:anchorId="58116A5E">
-          <v:rect id="_x0000_i1787" style="width:0;height:1.5pt" o:hralign="center" o:hrstd="t" o:hr="t" fillcolor="#a0a0a0" stroked="f"/>
+          <v:rect id="_x0000_i1123" style="width:0;height:1.5pt" o:hralign="center" o:hrstd="t" o:hr="t" fillcolor="#a0a0a0" stroked="f"/>
         </w:pict>
       </w:r>
     </w:p>
@@ -17453,7 +17459,7 @@
       <w:r>
         <w:lastRenderedPageBreak/>
         <w:pict w14:anchorId="2F2A7403">
-          <v:rect id="_x0000_i1788" style="width:0;height:1.5pt" o:hralign="center" o:hrstd="t" o:hr="t" fillcolor="#a0a0a0" stroked="f"/>
+          <v:rect id="_x0000_i1124" style="width:0;height:1.5pt" o:hralign="center" o:hrstd="t" o:hr="t" fillcolor="#a0a0a0" stroked="f"/>
         </w:pict>
       </w:r>
     </w:p>
@@ -21133,6 +21139,7 @@
   <w:style w:type="character" w:default="1" w:styleId="DefaultParagraphFont">
     <w:name w:val="Default Paragraph Font"/>
     <w:uiPriority w:val="1"/>
+    <w:semiHidden/>
     <w:unhideWhenUsed/>
   </w:style>
   <w:style w:type="table" w:default="1" w:styleId="TableNormal">

</xml_diff>